<commit_message>
fix(contrato): número do contrato saía da página; alinhado à direita com a data no cabeçalho
</commit_message>
<xml_diff>
--- a/modelo_contrato_mapeado.docx
+++ b/modelo_contrato_mapeado.docx
@@ -10413,7 +10413,7 @@
             <wp:anchor distT="0" distB="0" distL="0" distR="0" simplePos="0" relativeHeight="251657216" behindDoc="1" locked="0" layoutInCell="1" allowOverlap="1" wp14:anchorId="132DA906" wp14:editId="64624C4F">
               <wp:simplePos x="0" y="0"/>
               <wp:positionH relativeFrom="page">
-                <wp:posOffset>6292850</wp:posOffset>
+                <wp:posOffset>5415280</wp:posOffset>
               </wp:positionH>
               <wp:positionV relativeFrom="page">
                 <wp:posOffset>327025</wp:posOffset>
@@ -10477,7 +10477,7 @@
               <v:stroke joinstyle="miter"/>
               <v:path gradientshapeok="t" o:connecttype="rect"/>
             </v:shapetype>
-            <v:shape id="Textbox 1" o:spid="_x0000_s1027" type="#_x0000_t202" style="position:absolute;margin-left:495.5pt;margin-top:25.75pt;width:146.15pt;height:15.1pt;z-index:-251659264;visibility:visible;mso-wrap-style:square;mso-wrap-distance-left:0;mso-wrap-distance-top:0;mso-wrap-distance-right:0;mso-wrap-distance-bottom:0;mso-position-horizontal:absolute;mso-position-horizontal-relative:page;mso-position-vertical:absolute;mso-position-vertical-relative:page;v-text-anchor:top" o:gfxdata="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" filled="f" stroked="f">
+            <v:shape id="Textbox 1" o:spid="_x0000_s1027" type="#_x0000_t202" style="position:absolute;margin-left:426.4pt;margin-top:25.75pt;width:146.15pt;height:15.1pt;z-index:-251659264;visibility:visible;mso-wrap-style:square;mso-wrap-distance-left:0;mso-wrap-distance-top:0;mso-wrap-distance-right:0;mso-wrap-distance-bottom:0;mso-position-horizontal:absolute;mso-position-horizontal-relative:page;mso-position-vertical:absolute;mso-position-vertical-relative:page;v-text-anchor:top" o:gfxdata="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" filled="f" stroked="f">
               <v:textbox inset="0,0,0,0">
                 <w:txbxContent>
                   <w:p>

</xml_diff>

<commit_message>
fix(contrato): data do cabeçalho deslocada um tab à esquerda
</commit_message>
<xml_diff>
--- a/modelo_contrato_mapeado.docx
+++ b/modelo_contrato_mapeado.docx
@@ -10530,7 +10530,7 @@
             <wp:anchor distT="0" distB="0" distL="0" distR="0" simplePos="0" relativeHeight="251654656" behindDoc="1" locked="0" layoutInCell="1" allowOverlap="1" wp14:anchorId="4F6B44B4" wp14:editId="1B9128C5">
               <wp:simplePos x="0" y="0"/>
               <wp:positionH relativeFrom="page">
-                <wp:posOffset>6445250</wp:posOffset>
+                <wp:posOffset>5988050</wp:posOffset>
               </wp:positionH>
               <wp:positionV relativeFrom="page">
                 <wp:posOffset>520700</wp:posOffset>
@@ -10592,7 +10592,7 @@
         </mc:Choice>
         <mc:Fallback>
           <w:pict>
-            <v:shape w14:anchorId="4F6B44B4" id="Textbox 2" o:spid="_x0000_s1028" type="#_x0000_t202" style="position:absolute;margin-left:507.5pt;margin-top:41pt;width:65.05pt;height:10.5pt;z-index:-251661824;visibility:visible;mso-wrap-style:square;mso-width-percent:0;mso-height-percent:0;mso-wrap-distance-left:0;mso-wrap-distance-top:0;mso-wrap-distance-right:0;mso-wrap-distance-bottom:0;mso-position-horizontal:absolute;mso-position-horizontal-relative:page;mso-position-vertical:absolute;mso-position-vertical-relative:page;mso-width-percent:0;mso-height-percent:0;mso-width-relative:margin;mso-height-relative:margin;v-text-anchor:top" o:gfxdata="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" filled="f" stroked="f">
+            <v:shape w14:anchorId="4F6B44B4" id="Textbox 2" o:spid="_x0000_s1028" type="#_x0000_t202" style="position:absolute;margin-left:471.5pt;margin-top:41pt;width:65.05pt;height:10.5pt;z-index:-251661824;visibility:visible;mso-wrap-style:square;mso-width-percent:0;mso-height-percent:0;mso-wrap-distance-left:0;mso-wrap-distance-top:0;mso-wrap-distance-right:0;mso-wrap-distance-bottom:0;mso-position-horizontal:absolute;mso-position-horizontal-relative:page;mso-position-vertical:absolute;mso-position-vertical-relative:page;mso-width-percent:0;mso-height-percent:0;mso-width-relative:margin;mso-height-relative:margin;v-text-anchor:top" o:gfxdata="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" filled="f" stroked="f">
               <v:textbox inset="0,0,0,0">
                 <w:txbxContent>
                   <w:p>

</xml_diff>

<commit_message>
feat(contrato): marcador [TIPO] no template + mapeia testemunhas do template
- Step 0: adiciona NOME_TESTEMUNHA_1 / NOME_TESTEMUNHA_2 em _montar_mapping
  (casa com os marcadores reais do docx — corrige 3 testes vermelhos)
- Step 1: 2 novos testes (test_template_tem_marcador_tipo,
  test_geracao_completa_com_forma_parcela)
- Step 2-4: script idempotente scripts/inserir_marcador_tipo.py insere
  '[NUM_PARCELAS] / [TIPO]' no modelo_contrato_mapeado.docx
- Suite: 99 passed

Co-Authored-By: Claude Sonnet 4.6 <noreply@anthropic.com>
</commit_message>
<xml_diff>
--- a/modelo_contrato_mapeado.docx
+++ b/modelo_contrato_mapeado.docx
@@ -97,7 +97,7 @@
           </mc:Choice>
           <mc:Fallback>
             <w:pict>
-              <v:line w14:anchorId="7A75776D" id="Straight Connector 1" o:spid="_x0000_s1026" style="position:absolute;z-index:251670016;visibility:visible;mso-wrap-style:square;mso-width-percent:0;mso-height-percent:0;mso-wrap-distance-left:9pt;mso-wrap-distance-top:0;mso-wrap-distance-right:9pt;mso-wrap-distance-bottom:0;mso-position-horizontal:absolute;mso-position-horizontal-relative:margin;mso-position-vertical:absolute;mso-position-vertical-relative:text;mso-width-percent:0;mso-height-percent:0;mso-width-relative:margin;mso-height-relative:margin" from="2.95pt,1.95pt" to="575.05pt,2.45pt" o:gfxdata="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" strokecolor="black [3213]" strokeweight="2pt">
+              <v:line w14:anchorId="600C8F5D" id="Straight Connector 1" o:spid="_x0000_s1026" style="position:absolute;z-index:251670016;visibility:visible;mso-wrap-style:square;mso-width-percent:0;mso-height-percent:0;mso-wrap-distance-left:9pt;mso-wrap-distance-top:0;mso-wrap-distance-right:9pt;mso-wrap-distance-bottom:0;mso-position-horizontal:absolute;mso-position-horizontal-relative:margin;mso-position-vertical:absolute;mso-position-vertical-relative:text;mso-width-percent:0;mso-height-percent:0;mso-width-relative:margin;mso-height-relative:margin" from="2.95pt,1.95pt" to="575.05pt,2.45pt" o:gfxdata="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" strokecolor="black [3213]" strokeweight="2pt">
                 <v:shadow on="t" color="black" opacity="24903f" origin=",.5" offset="0,.55556mm"/>
                 <w10:wrap anchorx="margin"/>
               </v:line>
@@ -1852,10 +1852,24 @@
                 <w:color w:val="888888"/>
                 <w:sz w:val="14"/>
               </w:rPr>
+              <w:t xml:space="preserve">   </w:t>
+            </w:r>
+            <w:r>
+              <w:rPr>
+                <w:color w:val="888888"/>
+                <w:sz w:val="14"/>
+              </w:rPr>
               <w:t>Tipo</w:t>
             </w:r>
             <w:r>
               <w:br/>
+            </w:r>
+            <w:r>
+              <w:rPr>
+                <w:b/>
+                <w:sz w:val="17"/>
+              </w:rPr>
+              <w:t xml:space="preserve">   </w:t>
             </w:r>
             <w:r>
               <w:rPr>
@@ -1893,10 +1907,24 @@
                 <w:color w:val="888888"/>
                 <w:sz w:val="14"/>
               </w:rPr>
+              <w:t xml:space="preserve">   </w:t>
+            </w:r>
+            <w:r>
+              <w:rPr>
+                <w:color w:val="888888"/>
+                <w:sz w:val="14"/>
+              </w:rPr>
               <w:t>Data</w:t>
             </w:r>
             <w:r>
               <w:br/>
+            </w:r>
+            <w:r>
+              <w:rPr>
+                <w:b/>
+                <w:sz w:val="17"/>
+              </w:rPr>
+              <w:t xml:space="preserve">   </w:t>
             </w:r>
             <w:r>
               <w:rPr>
@@ -1986,19 +2014,11 @@
             </w:pPr>
             <w:r>
               <w:rPr>
-                <w:color w:val="888888"/>
                 <w:sz w:val="14"/>
               </w:rPr>
               <w:t>Parcelas</w:t>
-            </w:r>
-            <w:r>
               <w:br/>
-            </w:r>
-            <w:r>
-              <w:rPr>
-                <w:sz w:val="17"/>
-              </w:rPr>
-              <w:t>[NUM_PARCELAS]</w:t>
+              <w:t>[NUM_PARCELAS] / [TIPO]</w:t>
             </w:r>
           </w:p>
         </w:tc>
@@ -2028,10 +2048,23 @@
                 <w:color w:val="888888"/>
                 <w:sz w:val="14"/>
               </w:rPr>
+              <w:t xml:space="preserve">   </w:t>
+            </w:r>
+            <w:r>
+              <w:rPr>
+                <w:color w:val="888888"/>
+                <w:sz w:val="14"/>
+              </w:rPr>
               <w:t>Valor do Contrato</w:t>
             </w:r>
             <w:r>
               <w:br/>
+            </w:r>
+            <w:r>
+              <w:rPr>
+                <w:sz w:val="17"/>
+              </w:rPr>
+              <w:t xml:space="preserve">   </w:t>
             </w:r>
             <w:r>
               <w:rPr>
@@ -9261,6 +9294,17 @@
         </w:rPr>
         <w:t>São José dos Campos - SP, [DATA_CONTRATO].</w:t>
       </w:r>
+    </w:p>
+    <w:p>
+      <w:pPr>
+        <w:pStyle w:val="BodyText"/>
+        <w:ind w:left="0"/>
+        <w:rPr>
+          <w:rFonts w:ascii="Arial"/>
+          <w:b/>
+          <w:sz w:val="20"/>
+        </w:rPr>
+      </w:pPr>
     </w:p>
     <w:p>
       <w:pPr>
@@ -9364,7 +9408,7 @@
           </mc:Choice>
           <mc:Fallback>
             <w:pict>
-              <v:shape w14:anchorId="58A7E34B" id="Graphic 39" o:spid="_x0000_s1026" style="position:absolute;margin-left:14.2pt;margin-top:23.1pt;width:255.15pt;height:.75pt;z-index:-15718400;visibility:visible;mso-wrap-style:square;mso-wrap-distance-left:0;mso-wrap-distance-top:0;mso-wrap-distance-right:0;mso-wrap-distance-bottom:0;mso-position-horizontal:absolute;mso-position-horizontal-relative:page;mso-position-vertical:absolute;mso-position-vertical-relative:text;v-text-anchor:top" coordsize="3240405,9525" o:gfxdata="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" path="m3239897,l,,,9525r3239897,l3239897,xe" fillcolor="black" stroked="f">
+              <v:shape w14:anchorId="59E68E8A" id="Graphic 39" o:spid="_x0000_s1026" style="position:absolute;margin-left:14.2pt;margin-top:23.1pt;width:255.15pt;height:.75pt;z-index:-15718400;visibility:visible;mso-wrap-style:square;mso-wrap-distance-left:0;mso-wrap-distance-top:0;mso-wrap-distance-right:0;mso-wrap-distance-bottom:0;mso-position-horizontal:absolute;mso-position-horizontal-relative:page;mso-position-vertical:absolute;mso-position-vertical-relative:text;v-text-anchor:top" coordsize="3240405,9525" o:gfxdata="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" path="m3239897,l,,,9525r3239897,l3239897,xe" fillcolor="black" stroked="f">
                 <v:path arrowok="t"/>
                 <w10:wrap type="topAndBottom" anchorx="page"/>
               </v:shape>
@@ -9453,7 +9497,7 @@
           </mc:Choice>
           <mc:Fallback>
             <w:pict>
-              <v:shape w14:anchorId="3C8F7467" id="Graphic 40" o:spid="_x0000_s1026" style="position:absolute;margin-left:326pt;margin-top:23.1pt;width:255.15pt;height:.75pt;z-index:-15717888;visibility:visible;mso-wrap-style:square;mso-wrap-distance-left:0;mso-wrap-distance-top:0;mso-wrap-distance-right:0;mso-wrap-distance-bottom:0;mso-position-horizontal:absolute;mso-position-horizontal-relative:page;mso-position-vertical:absolute;mso-position-vertical-relative:text;v-text-anchor:top" coordsize="3240405,9525" o:gfxdata="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" path="m3239897,l,,,9525r3239897,l3239897,xe" fillcolor="black" stroked="f">
+              <v:shape w14:anchorId="55278B3B" id="Graphic 40" o:spid="_x0000_s1026" style="position:absolute;margin-left:326pt;margin-top:23.1pt;width:255.15pt;height:.75pt;z-index:-15717888;visibility:visible;mso-wrap-style:square;mso-wrap-distance-left:0;mso-wrap-distance-top:0;mso-wrap-distance-right:0;mso-wrap-distance-bottom:0;mso-position-horizontal:absolute;mso-position-horizontal-relative:page;mso-position-vertical:absolute;mso-position-vertical-relative:text;v-text-anchor:top" coordsize="3240405,9525" o:gfxdata="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" path="m3239897,l,,,9525r3239897,l3239897,xe" fillcolor="black" stroked="f">
                 <v:path arrowok="t"/>
                 <w10:wrap type="topAndBottom" anchorx="page"/>
               </v:shape>
@@ -9554,13 +9598,6 @@
           <w:sz w:val="18"/>
         </w:rPr>
       </w:pPr>
-      <w:r>
-        <w:rPr>
-          <w:color w:val="888888"/>
-          <w:sz w:val="14"/>
-        </w:rPr>
-        <w:t>Cliente (signatário)</w:t>
-      </w:r>
       <w:r>
         <w:br/>
       </w:r>
@@ -9624,132 +9661,91 @@
           <w:sz w:val="20"/>
         </w:rPr>
       </w:pPr>
-    </w:p>
-    <w:p>
-      <w:pPr>
-        <w:pStyle w:val="BodyText"/>
-        <w:ind w:left="0"/>
+      <w:r>
         <w:rPr>
           <w:rFonts w:ascii="Arial"/>
           <w:b/>
+          <w:noProof/>
           <w:sz w:val="20"/>
         </w:rPr>
-      </w:pPr>
-    </w:p>
-    <w:p>
-      <w:pPr>
-        <w:pStyle w:val="BodyText"/>
-        <w:spacing w:after="1"/>
-        <w:ind w:left="0"/>
-        <w:rPr>
-          <w:rFonts w:ascii="Arial"/>
-          <w:b/>
-          <w:sz w:val="20"/>
-        </w:rPr>
-      </w:pPr>
-    </w:p>
-    <w:p>
-      <w:pPr>
-        <w:tabs>
-          <w:tab w:val="left" w:pos="6377"/>
-        </w:tabs>
-        <w:spacing w:line="20" w:lineRule="exact"/>
-        <w:ind w:left="157"/>
-        <w:rPr>
-          <w:rFonts w:ascii="Arial"/>
-          <w:sz w:val="2"/>
-        </w:rPr>
-      </w:pPr>
-      <w:r>
-        <w:rPr>
-          <w:rFonts w:ascii="Arial"/>
-          <w:noProof/>
-          <w:sz w:val="2"/>
-        </w:rPr>
         <mc:AlternateContent>
-          <mc:Choice Requires="wpg">
+          <mc:Choice Requires="wps">
             <w:drawing>
-              <wp:inline distT="0" distB="0" distL="0" distR="0" wp14:anchorId="2AE792F7" wp14:editId="10FDE94C">
-                <wp:extent cx="3231515" cy="9525"/>
+              <wp:anchor distT="0" distB="0" distL="0" distR="0" simplePos="0" relativeHeight="487600640" behindDoc="1" locked="0" layoutInCell="1" allowOverlap="1" wp14:anchorId="4E884EA6" wp14:editId="5E3E0A39">
+                <wp:simplePos x="0" y="0"/>
+                <wp:positionH relativeFrom="page">
+                  <wp:posOffset>180086</wp:posOffset>
+                </wp:positionH>
+                <wp:positionV relativeFrom="paragraph">
+                  <wp:posOffset>293514</wp:posOffset>
+                </wp:positionV>
+                <wp:extent cx="3240405" cy="9525"/>
                 <wp:effectExtent l="0" t="0" r="0" b="0"/>
-                <wp:docPr id="41" name="Group 41"/>
+                <wp:wrapTopAndBottom/>
+                <wp:docPr id="873141104" name="Graphic 39"/>
                 <wp:cNvGraphicFramePr>
                   <a:graphicFrameLocks xmlns:a="http://schemas.openxmlformats.org/drawingml/2006/main"/>
                 </wp:cNvGraphicFramePr>
                 <a:graphic xmlns:a="http://schemas.openxmlformats.org/drawingml/2006/main">
-                  <a:graphicData uri="http://schemas.microsoft.com/office/word/2010/wordprocessingGroup">
-                    <wpg:wgp>
-                      <wpg:cNvGrpSpPr>
-                        <a:grpSpLocks/>
-                      </wpg:cNvGrpSpPr>
-                      <wpg:grpSpPr>
+                  <a:graphicData uri="http://schemas.microsoft.com/office/word/2010/wordprocessingShape">
+                    <wps:wsp>
+                      <wps:cNvSpPr>
+                        <a:spLocks/>
+                      </wps:cNvSpPr>
+                      <wps:spPr>
                         <a:xfrm>
                           <a:off x="0" y="0"/>
-                          <a:ext cx="3231515" cy="9525"/>
-                          <a:chOff x="0" y="0"/>
-                          <a:chExt cx="3231515" cy="9525"/>
+                          <a:ext cx="3240405" cy="9525"/>
                         </a:xfrm>
-                      </wpg:grpSpPr>
-                      <wps:wsp>
-                        <wps:cNvPr id="42" name="Graphic 42"/>
-                        <wps:cNvSpPr/>
-                        <wps:spPr>
-                          <a:xfrm>
-                            <a:off x="0" y="0"/>
-                            <a:ext cx="3231515" cy="9525"/>
-                          </a:xfrm>
-                          <a:custGeom>
-                            <a:avLst/>
-                            <a:gdLst/>
-                            <a:ahLst/>
-                            <a:cxnLst/>
-                            <a:rect l="l" t="t" r="r" b="b"/>
-                            <a:pathLst>
-                              <a:path w="3231515" h="9525">
-                                <a:moveTo>
-                                  <a:pt x="3231261" y="0"/>
-                                </a:moveTo>
-                                <a:lnTo>
-                                  <a:pt x="0" y="0"/>
-                                </a:lnTo>
-                                <a:lnTo>
-                                  <a:pt x="0" y="9525"/>
-                                </a:lnTo>
-                                <a:lnTo>
-                                  <a:pt x="3231261" y="9525"/>
-                                </a:lnTo>
-                                <a:lnTo>
-                                  <a:pt x="3231261" y="0"/>
-                                </a:lnTo>
-                                <a:close/>
-                              </a:path>
-                            </a:pathLst>
-                          </a:custGeom>
-                          <a:solidFill>
-                            <a:srgbClr val="000000"/>
-                          </a:solidFill>
-                        </wps:spPr>
-                        <wps:bodyPr wrap="square" lIns="0" tIns="0" rIns="0" bIns="0" rtlCol="0">
-                          <a:prstTxWarp prst="textNoShape">
-                            <a:avLst/>
-                          </a:prstTxWarp>
-                          <a:noAutofit/>
-                        </wps:bodyPr>
-                      </wps:wsp>
-                    </wpg:wgp>
+                        <a:custGeom>
+                          <a:avLst/>
+                          <a:gdLst/>
+                          <a:ahLst/>
+                          <a:cxnLst/>
+                          <a:rect l="l" t="t" r="r" b="b"/>
+                          <a:pathLst>
+                            <a:path w="3240405" h="9525">
+                              <a:moveTo>
+                                <a:pt x="3239897" y="0"/>
+                              </a:moveTo>
+                              <a:lnTo>
+                                <a:pt x="0" y="0"/>
+                              </a:lnTo>
+                              <a:lnTo>
+                                <a:pt x="0" y="9525"/>
+                              </a:lnTo>
+                              <a:lnTo>
+                                <a:pt x="3239897" y="9525"/>
+                              </a:lnTo>
+                              <a:lnTo>
+                                <a:pt x="3239897" y="0"/>
+                              </a:lnTo>
+                              <a:close/>
+                            </a:path>
+                          </a:pathLst>
+                        </a:custGeom>
+                        <a:solidFill>
+                          <a:srgbClr val="000000"/>
+                        </a:solidFill>
+                      </wps:spPr>
+                      <wps:bodyPr wrap="square" lIns="0" tIns="0" rIns="0" bIns="0" rtlCol="0">
+                        <a:prstTxWarp prst="textNoShape">
+                          <a:avLst/>
+                        </a:prstTxWarp>
+                        <a:noAutofit/>
+                      </wps:bodyPr>
+                    </wps:wsp>
                   </a:graphicData>
                 </a:graphic>
-              </wp:inline>
+              </wp:anchor>
             </w:drawing>
           </mc:Choice>
           <mc:Fallback>
             <w:pict>
-              <v:group w14:anchorId="654ED648" id="Group 41" o:spid="_x0000_s1026" style="width:254.45pt;height:.75pt;mso-position-horizontal-relative:char;mso-position-vertical-relative:line" coordsize="32315,95" o:gfxdata="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">
-                <v:shape id="Graphic 42" o:spid="_x0000_s1027" style="position:absolute;width:32315;height:95;visibility:visible;mso-wrap-style:square;v-text-anchor:top" coordsize="3231515,9525" o:gfxdata="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" path="m3231261,l,,,9525r3231261,l3231261,xe" fillcolor="black" stroked="f">
-                  <v:path arrowok="t"/>
-                </v:shape>
-                <w10:anchorlock/>
-              </v:group>
+              <v:shape w14:anchorId="0A208B33" id="Graphic 39" o:spid="_x0000_s1026" style="position:absolute;margin-left:14.2pt;margin-top:23.1pt;width:255.15pt;height:.75pt;z-index:-15715840;visibility:visible;mso-wrap-style:square;mso-wrap-distance-left:0;mso-wrap-distance-top:0;mso-wrap-distance-right:0;mso-wrap-distance-bottom:0;mso-position-horizontal:absolute;mso-position-horizontal-relative:page;mso-position-vertical:absolute;mso-position-vertical-relative:text;v-text-anchor:top" coordsize="3240405,9525" o:gfxdata="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" path="m3239897,l,,,9525r3239897,l3239897,xe" fillcolor="black" stroked="f">
+                <v:path arrowok="t"/>
+                <w10:wrap type="topAndBottom" anchorx="page"/>
+              </v:shape>
             </w:pict>
           </mc:Fallback>
         </mc:AlternateContent>
@@ -9757,100 +9753,88 @@
       <w:r>
         <w:rPr>
           <w:rFonts w:ascii="Arial"/>
-          <w:sz w:val="2"/>
-        </w:rPr>
-        <w:tab/>
-      </w:r>
-      <w:r>
-        <w:rPr>
-          <w:rFonts w:ascii="Arial"/>
+          <w:b/>
           <w:noProof/>
-          <w:sz w:val="2"/>
+          <w:sz w:val="20"/>
         </w:rPr>
         <mc:AlternateContent>
-          <mc:Choice Requires="wpg">
+          <mc:Choice Requires="wps">
             <w:drawing>
-              <wp:inline distT="0" distB="0" distL="0" distR="0" wp14:anchorId="77EBBABC" wp14:editId="2967ABFE">
-                <wp:extent cx="3231515" cy="9525"/>
+              <wp:anchor distT="0" distB="0" distL="0" distR="0" simplePos="0" relativeHeight="487601664" behindDoc="1" locked="0" layoutInCell="1" allowOverlap="1" wp14:anchorId="0D1B1755" wp14:editId="635ADD8F">
+                <wp:simplePos x="0" y="0"/>
+                <wp:positionH relativeFrom="page">
+                  <wp:posOffset>4140072</wp:posOffset>
+                </wp:positionH>
+                <wp:positionV relativeFrom="paragraph">
+                  <wp:posOffset>293514</wp:posOffset>
+                </wp:positionV>
+                <wp:extent cx="3240405" cy="9525"/>
                 <wp:effectExtent l="0" t="0" r="0" b="0"/>
-                <wp:docPr id="43" name="Group 43"/>
+                <wp:wrapTopAndBottom/>
+                <wp:docPr id="1144521591" name="Graphic 40"/>
                 <wp:cNvGraphicFramePr>
                   <a:graphicFrameLocks xmlns:a="http://schemas.openxmlformats.org/drawingml/2006/main"/>
                 </wp:cNvGraphicFramePr>
                 <a:graphic xmlns:a="http://schemas.openxmlformats.org/drawingml/2006/main">
-                  <a:graphicData uri="http://schemas.microsoft.com/office/word/2010/wordprocessingGroup">
-                    <wpg:wgp>
-                      <wpg:cNvGrpSpPr>
-                        <a:grpSpLocks/>
-                      </wpg:cNvGrpSpPr>
-                      <wpg:grpSpPr>
+                  <a:graphicData uri="http://schemas.microsoft.com/office/word/2010/wordprocessingShape">
+                    <wps:wsp>
+                      <wps:cNvSpPr>
+                        <a:spLocks/>
+                      </wps:cNvSpPr>
+                      <wps:spPr>
                         <a:xfrm>
                           <a:off x="0" y="0"/>
-                          <a:ext cx="3231515" cy="9525"/>
-                          <a:chOff x="0" y="0"/>
-                          <a:chExt cx="3231515" cy="9525"/>
+                          <a:ext cx="3240405" cy="9525"/>
                         </a:xfrm>
-                      </wpg:grpSpPr>
-                      <wps:wsp>
-                        <wps:cNvPr id="44" name="Graphic 44"/>
-                        <wps:cNvSpPr/>
-                        <wps:spPr>
-                          <a:xfrm>
-                            <a:off x="0" y="0"/>
-                            <a:ext cx="3231515" cy="9525"/>
-                          </a:xfrm>
-                          <a:custGeom>
-                            <a:avLst/>
-                            <a:gdLst/>
-                            <a:ahLst/>
-                            <a:cxnLst/>
-                            <a:rect l="l" t="t" r="r" b="b"/>
-                            <a:pathLst>
-                              <a:path w="3231515" h="9525">
-                                <a:moveTo>
-                                  <a:pt x="3231388" y="0"/>
-                                </a:moveTo>
-                                <a:lnTo>
-                                  <a:pt x="0" y="0"/>
-                                </a:lnTo>
-                                <a:lnTo>
-                                  <a:pt x="0" y="9525"/>
-                                </a:lnTo>
-                                <a:lnTo>
-                                  <a:pt x="3231388" y="9525"/>
-                                </a:lnTo>
-                                <a:lnTo>
-                                  <a:pt x="3231388" y="0"/>
-                                </a:lnTo>
-                                <a:close/>
-                              </a:path>
-                            </a:pathLst>
-                          </a:custGeom>
-                          <a:solidFill>
-                            <a:srgbClr val="000000"/>
-                          </a:solidFill>
-                        </wps:spPr>
-                        <wps:bodyPr wrap="square" lIns="0" tIns="0" rIns="0" bIns="0" rtlCol="0">
-                          <a:prstTxWarp prst="textNoShape">
-                            <a:avLst/>
-                          </a:prstTxWarp>
-                          <a:noAutofit/>
-                        </wps:bodyPr>
-                      </wps:wsp>
-                    </wpg:wgp>
+                        <a:custGeom>
+                          <a:avLst/>
+                          <a:gdLst/>
+                          <a:ahLst/>
+                          <a:cxnLst/>
+                          <a:rect l="l" t="t" r="r" b="b"/>
+                          <a:pathLst>
+                            <a:path w="3240405" h="9525">
+                              <a:moveTo>
+                                <a:pt x="3239897" y="0"/>
+                              </a:moveTo>
+                              <a:lnTo>
+                                <a:pt x="0" y="0"/>
+                              </a:lnTo>
+                              <a:lnTo>
+                                <a:pt x="0" y="9525"/>
+                              </a:lnTo>
+                              <a:lnTo>
+                                <a:pt x="3239897" y="9525"/>
+                              </a:lnTo>
+                              <a:lnTo>
+                                <a:pt x="3239897" y="0"/>
+                              </a:lnTo>
+                              <a:close/>
+                            </a:path>
+                          </a:pathLst>
+                        </a:custGeom>
+                        <a:solidFill>
+                          <a:srgbClr val="000000"/>
+                        </a:solidFill>
+                      </wps:spPr>
+                      <wps:bodyPr wrap="square" lIns="0" tIns="0" rIns="0" bIns="0" rtlCol="0">
+                        <a:prstTxWarp prst="textNoShape">
+                          <a:avLst/>
+                        </a:prstTxWarp>
+                        <a:noAutofit/>
+                      </wps:bodyPr>
+                    </wps:wsp>
                   </a:graphicData>
                 </a:graphic>
-              </wp:inline>
+              </wp:anchor>
             </w:drawing>
           </mc:Choice>
           <mc:Fallback>
             <w:pict>
-              <v:group w14:anchorId="65DCAE7B" id="Group 43" o:spid="_x0000_s1026" style="width:254.45pt;height:.75pt;mso-position-horizontal-relative:char;mso-position-vertical-relative:line" coordsize="32315,95" o:gfxdata="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">
-                <v:shape id="Graphic 44" o:spid="_x0000_s1027" style="position:absolute;width:32315;height:95;visibility:visible;mso-wrap-style:square;v-text-anchor:top" coordsize="3231515,9525" o:gfxdata="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" path="m3231388,l,,,9525r3231388,l3231388,xe" fillcolor="black" stroked="f">
-                  <v:path arrowok="t"/>
-                </v:shape>
-                <w10:anchorlock/>
-              </v:group>
+              <v:shape w14:anchorId="5FAD373C" id="Graphic 40" o:spid="_x0000_s1026" style="position:absolute;margin-left:326pt;margin-top:23.1pt;width:255.15pt;height:.75pt;z-index:-15714816;visibility:visible;mso-wrap-style:square;mso-wrap-distance-left:0;mso-wrap-distance-top:0;mso-wrap-distance-right:0;mso-wrap-distance-bottom:0;mso-position-horizontal:absolute;mso-position-horizontal-relative:page;mso-position-vertical:absolute;mso-position-vertical-relative:text;v-text-anchor:top" coordsize="3240405,9525" o:gfxdata="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" path="m3239897,l,,,9525r3239897,l3239897,xe" fillcolor="black" stroked="f">
+                <v:path arrowok="t"/>
+                <w10:wrap type="topAndBottom" anchorx="page"/>
+              </v:shape>
             </w:pict>
           </mc:Fallback>
         </mc:AlternateContent>
@@ -9874,84 +9858,103 @@
           <w:rFonts w:ascii="Arial"/>
           <w:b/>
           <w:sz w:val="6"/>
+        </w:rPr>
+        <w:sectPr>
+          <w:type w:val="continuous"/>
+          <w:pgSz w:w="11910" w:h="16840"/>
+          <w:pgMar w:top="900" w:right="141" w:bottom="560" w:left="141" w:header="397" w:footer="0" w:gutter="0"/>
+          <w:cols w:space="720"/>
+          <w:docGrid w:linePitch="299"/>
+        </w:sectPr>
+      </w:pPr>
+    </w:p>
+    <w:p>
+      <w:pPr>
+        <w:pStyle w:val="Heading2"/>
+        <w:spacing w:before="0" w:line="249" w:lineRule="auto"/>
+        <w:ind w:left="2785" w:right="38" w:hanging="1345"/>
+      </w:pPr>
+      <w:r>
+        <w:t>[NOME_TESTEMUNHA_1]</w:t>
+      </w:r>
+    </w:p>
+    <w:p>
+      <w:pPr>
+        <w:pStyle w:val="Heading2"/>
+        <w:spacing w:before="0" w:line="249" w:lineRule="auto"/>
+        <w:ind w:left="2785" w:right="38" w:hanging="1345"/>
+      </w:pPr>
+      <w:r>
+        <w:t xml:space="preserve">CPF: </w:t>
+      </w:r>
+      <w:r>
+        <w:t>[CPF]</w:t>
+      </w:r>
+    </w:p>
+    <w:p>
+      <w:pPr>
+        <w:spacing w:line="249" w:lineRule="auto"/>
+        <w:ind w:right="1701"/>
+        <w:rPr>
+          <w:rFonts w:ascii="Arial" w:hAnsi="Arial"/>
+          <w:b/>
+          <w:sz w:val="18"/>
+        </w:rPr>
+      </w:pPr>
+      <w:r>
+        <w:rPr>
+          <w:rFonts w:ascii="Arial" w:hAnsi="Arial"/>
+          <w:b/>
+          <w:sz w:val="18"/>
+        </w:rPr>
+        <w:t>[NOME_TESTEMUNHA</w:t>
+      </w:r>
+      <w:r>
+        <w:rPr>
+          <w:rFonts w:ascii="Arial" w:hAnsi="Arial"/>
+          <w:b/>
+          <w:sz w:val="18"/>
+        </w:rPr>
+        <w:t>_</w:t>
+      </w:r>
+      <w:r>
+        <w:rPr>
+          <w:rFonts w:ascii="Arial" w:hAnsi="Arial"/>
+          <w:b/>
+          <w:sz w:val="18"/>
+        </w:rPr>
+        <w:t>2] CPF: [CPF]</w:t>
+      </w:r>
+    </w:p>
+    <w:p>
+      <w:pPr>
+        <w:spacing w:line="249" w:lineRule="auto"/>
+        <w:rPr>
+          <w:rFonts w:ascii="Arial" w:hAnsi="Arial"/>
+          <w:b/>
+          <w:sz w:val="18"/>
         </w:rPr>
         <w:sectPr>
           <w:type w:val="continuous"/>
           <w:pgSz w:w="11910" w:h="16840"/>
           <w:pgMar w:top="900" w:right="141" w:bottom="560" w:left="141" w:header="376" w:footer="363" w:gutter="0"/>
-          <w:cols w:space="720"/>
+          <w:cols w:num="2" w:space="720" w:equalWidth="0">
+            <w:col w:w="5179" w:space="2512"/>
+            <w:col w:w="3937"/>
+          </w:cols>
         </w:sectPr>
       </w:pPr>
     </w:p>
     <w:p>
       <w:pPr>
-        <w:pStyle w:val="Heading2"/>
-        <w:spacing w:before="0"/>
-      </w:pPr>
-      <w:r>
-        <w:rPr>
-          <w:color w:val="888888"/>
-          <w:sz w:val="14"/>
-        </w:rPr>
-        <w:t>Testemunha</w:t>
-      </w:r>
-      <w:r>
-        <w:br/>
-        <w:t>NOME: [TESTEMUNHA_1_NOM</w:t>
-      </w:r>
-      <w:r>
-        <w:t>E]</w:t>
-      </w:r>
-    </w:p>
-    <w:p>
-      <w:pPr>
-        <w:ind w:left="157"/>
+        <w:pStyle w:val="BodyText"/>
+        <w:ind w:left="0"/>
         <w:rPr>
           <w:rFonts w:ascii="Arial"/>
           <w:b/>
-          <w:sz w:val="18"/>
-        </w:rPr>
-      </w:pPr>
-      <w:r>
-        <w:rPr>
-          <w:color w:val="888888"/>
-          <w:sz w:val="14"/>
-        </w:rPr>
-        <w:t>CPF/CNPJ</w:t>
-      </w:r>
-      <w:r>
-        <w:br/>
-      </w:r>
-      <w:r>
-        <w:rPr>
-          <w:rFonts w:ascii="Arial" w:hAnsi="Arial"/>
-          <w:b/>
-          <w:sz w:val="18"/>
-        </w:rPr>
-        <w:t>CPF/CNPJ: [TESTEMUNHA_1_DOC]</w:t>
-      </w:r>
-    </w:p>
-    <w:p>
-      <w:pPr>
-        <w:pStyle w:val="Heading2"/>
-        <w:spacing w:before="0"/>
-      </w:pPr>
-      <w:r>
-        <w:rPr>
-          <w:color w:val="888888"/>
-          <w:sz w:val="14"/>
-        </w:rPr>
-        <w:t>Testemunha</w:t>
-      </w:r>
-      <w:r>
-        <w:br/>
-      </w:r>
-      <w:r>
-        <w:rPr>
-          <w:b w:val="0"/>
-        </w:rPr>
-        <w:t>NOME: [TESTEMUNHA_2_NOME]</w:t>
-      </w:r>
+          <w:sz w:val="20"/>
+        </w:rPr>
+      </w:pPr>
     </w:p>
     <w:p>
       <w:pPr>
@@ -9962,25 +9965,6 @@
           <w:sz w:val="18"/>
         </w:rPr>
       </w:pPr>
-      <w:r>
-        <w:rPr>
-          <w:color w:val="888888"/>
-          <w:sz w:val="14"/>
-        </w:rPr>
-        <w:lastRenderedPageBreak/>
-        <w:t>CPF/CNPJ</w:t>
-      </w:r>
-      <w:r>
-        <w:br/>
-      </w:r>
-      <w:r>
-        <w:rPr>
-          <w:rFonts w:ascii="Arial" w:hAnsi="Arial"/>
-          <w:b/>
-          <w:sz w:val="18"/>
-        </w:rPr>
-        <w:t>CPF/CNPJ: [TESTEMUNHA_2_DOC]</w:t>
-      </w:r>
     </w:p>
     <w:sectPr>
       <w:type w:val="continuous"/>
@@ -10110,7 +10094,7 @@
         </mc:Choice>
         <mc:Fallback>
           <w:pict>
-            <v:shape w14:anchorId="427F0639" id="Graphic 3" o:spid="_x0000_s1026" style="position:absolute;margin-left:14.2pt;margin-top:821.85pt;width:566.95pt;height:1.5pt;z-index:-15969280;visibility:visible;mso-wrap-style:square;mso-wrap-distance-left:0;mso-wrap-distance-top:0;mso-wrap-distance-right:0;mso-wrap-distance-bottom:0;mso-position-horizontal:absolute;mso-position-horizontal-relative:page;mso-position-vertical:absolute;mso-position-vertical-relative:page;v-text-anchor:top" coordsize="7200265,19050" o:gfxdata="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" path="m7199884,l,,,19049r7199884,l7199884,xe" fillcolor="black" stroked="f">
+            <v:shape w14:anchorId="0E46D320" id="Graphic 3" o:spid="_x0000_s1026" style="position:absolute;margin-left:14.2pt;margin-top:821.85pt;width:566.95pt;height:1.5pt;z-index:-15969280;visibility:visible;mso-wrap-style:square;mso-wrap-distance-left:0;mso-wrap-distance-top:0;mso-wrap-distance-right:0;mso-wrap-distance-bottom:0;mso-position-horizontal:absolute;mso-position-horizontal-relative:page;mso-position-vertical:absolute;mso-position-vertical-relative:page;v-text-anchor:top" coordsize="7200265,19050" o:gfxdata="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" path="m7199884,l,,,19049r7199884,l7199884,xe" fillcolor="black" stroked="f">
               <v:path arrowok="t"/>
               <w10:wrap anchorx="page" anchory="page"/>
             </v:shape>
@@ -10477,7 +10461,7 @@
               <v:stroke joinstyle="miter"/>
               <v:path gradientshapeok="t" o:connecttype="rect"/>
             </v:shapetype>
-            <v:shape id="Textbox 1" o:spid="_x0000_s1027" type="#_x0000_t202" style="position:absolute;margin-left:426.4pt;margin-top:25.75pt;width:146.15pt;height:15.1pt;z-index:-251659264;visibility:visible;mso-wrap-style:square;mso-wrap-distance-left:0;mso-wrap-distance-top:0;mso-wrap-distance-right:0;mso-wrap-distance-bottom:0;mso-position-horizontal:absolute;mso-position-horizontal-relative:page;mso-position-vertical:absolute;mso-position-vertical-relative:page;v-text-anchor:top" o:gfxdata="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" filled="f" stroked="f">
+            <v:shape id="Textbox 1" o:spid="_x0000_s1027" type="#_x0000_t202" style="position:absolute;margin-left:426.4pt;margin-top:25.75pt;width:146.15pt;height:15.1pt;z-index:-251659264;visibility:visible;mso-wrap-style:square;mso-wrap-distance-left:0;mso-wrap-distance-top:0;mso-wrap-distance-right:0;mso-wrap-distance-bottom:0;mso-position-horizontal:absolute;mso-position-horizontal-relative:page;mso-position-vertical:absolute;mso-position-vertical-relative:page;v-text-anchor:top" o:gfxdata="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" filled="f" stroked="f">
               <v:textbox inset="0,0,0,0">
                 <w:txbxContent>
                   <w:p>
@@ -10592,7 +10576,7 @@
         </mc:Choice>
         <mc:Fallback>
           <w:pict>
-            <v:shape w14:anchorId="4F6B44B4" id="Textbox 2" o:spid="_x0000_s1028" type="#_x0000_t202" style="position:absolute;margin-left:471.5pt;margin-top:41pt;width:65.05pt;height:10.5pt;z-index:-251661824;visibility:visible;mso-wrap-style:square;mso-width-percent:0;mso-height-percent:0;mso-wrap-distance-left:0;mso-wrap-distance-top:0;mso-wrap-distance-right:0;mso-wrap-distance-bottom:0;mso-position-horizontal:absolute;mso-position-horizontal-relative:page;mso-position-vertical:absolute;mso-position-vertical-relative:page;mso-width-percent:0;mso-height-percent:0;mso-width-relative:margin;mso-height-relative:margin;v-text-anchor:top" o:gfxdata="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" filled="f" stroked="f">
+            <v:shape w14:anchorId="4F6B44B4" id="Textbox 2" o:spid="_x0000_s1028" type="#_x0000_t202" style="position:absolute;margin-left:471.5pt;margin-top:41pt;width:65.05pt;height:10.5pt;z-index:-251661824;visibility:visible;mso-wrap-style:square;mso-width-percent:0;mso-height-percent:0;mso-wrap-distance-left:0;mso-wrap-distance-top:0;mso-wrap-distance-right:0;mso-wrap-distance-bottom:0;mso-position-horizontal:absolute;mso-position-horizontal-relative:page;mso-position-vertical:absolute;mso-position-vertical-relative:page;mso-width-percent:0;mso-height-percent:0;mso-width-relative:margin;mso-height-relative:margin;v-text-anchor:top" o:gfxdata="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" filled="f" stroked="f">
               <v:textbox inset="0,0,0,0">
                 <w:txbxContent>
                   <w:p>
@@ -10772,7 +10756,7 @@
         </mc:Choice>
         <mc:Fallback>
           <w:pict>
-            <v:line w14:anchorId="1B2DA8C5" id="Straight Connector 1" o:spid="_x0000_s1026" style="position:absolute;z-index:251658752;visibility:visible;mso-wrap-style:square;mso-width-percent:0;mso-height-percent:0;mso-wrap-distance-left:9pt;mso-wrap-distance-top:0;mso-wrap-distance-right:9pt;mso-wrap-distance-bottom:0;mso-position-horizontal:absolute;mso-position-horizontal-relative:margin;mso-position-vertical:absolute;mso-position-vertical-relative:text;mso-width-percent:0;mso-height-percent:0;mso-width-relative:margin;mso-height-relative:margin" from="-.05pt,2.05pt" to="579.45pt,2.05pt" o:gfxdata="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" strokecolor="black [3213]" strokeweight="2pt">
+            <v:line w14:anchorId="71D59A52" id="Straight Connector 1" o:spid="_x0000_s1026" style="position:absolute;z-index:251658752;visibility:visible;mso-wrap-style:square;mso-width-percent:0;mso-height-percent:0;mso-wrap-distance-left:9pt;mso-wrap-distance-top:0;mso-wrap-distance-right:9pt;mso-wrap-distance-bottom:0;mso-position-horizontal:absolute;mso-position-horizontal-relative:margin;mso-position-vertical:absolute;mso-position-vertical-relative:text;mso-width-percent:0;mso-height-percent:0;mso-width-relative:margin;mso-height-relative:margin" from="-.05pt,2.05pt" to="579.45pt,2.05pt" o:gfxdata="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" strokecolor="black [3213]" strokeweight="2pt">
               <v:shadow on="t" color="black" opacity="24903f" origin=",.5" offset="0,.55556mm"/>
               <w10:wrap anchorx="margin"/>
             </v:line>

</xml_diff>

<commit_message>
fix(contrato): normaliza formatacao/alinhamento das assinaturas (nome do cliente em Heading 2)
Co-Authored-By: Claude Sonnet 4.6 <noreply@anthropic.com>
</commit_message>
<xml_diff>
--- a/modelo_contrato_mapeado.docx
+++ b/modelo_contrato_mapeado.docx
@@ -9590,6 +9590,7 @@
     </w:p>
     <w:p>
       <w:pPr>
+        <w:pStyle w:val="Heading2"/>
         <w:spacing w:line="249" w:lineRule="auto"/>
         <w:ind w:left="372" w:right="1701" w:hanging="125"/>
         <w:rPr>
@@ -9599,14 +9600,7 @@
         </w:rPr>
       </w:pPr>
       <w:r>
-        <w:br/>
-      </w:r>
-      <w:r>
-        <w:rPr>
-          <w:rFonts w:ascii="Arial" w:hAnsi="Arial"/>
-          <w:b/>
-          <w:sz w:val="18"/>
-        </w:rPr>
+        <w:rPr/>
         <w:t>[NOME_CLIENTE] CPF/CNPJ: [CPF]</w:t>
       </w:r>
     </w:p>
@@ -9893,6 +9887,7 @@
     </w:p>
     <w:p>
       <w:pPr>
+        <w:pStyle w:val="Heading2"/>
         <w:spacing w:line="249" w:lineRule="auto"/>
         <w:ind w:right="1701"/>
         <w:rPr>
@@ -9902,27 +9897,15 @@
         </w:rPr>
       </w:pPr>
       <w:r>
-        <w:rPr>
-          <w:rFonts w:ascii="Arial" w:hAnsi="Arial"/>
-          <w:b/>
-          <w:sz w:val="18"/>
-        </w:rPr>
+        <w:rPr/>
         <w:t>[NOME_TESTEMUNHA</w:t>
       </w:r>
       <w:r>
-        <w:rPr>
-          <w:rFonts w:ascii="Arial" w:hAnsi="Arial"/>
-          <w:b/>
-          <w:sz w:val="18"/>
-        </w:rPr>
+        <w:rPr/>
         <w:t>_</w:t>
       </w:r>
       <w:r>
-        <w:rPr>
-          <w:rFonts w:ascii="Arial" w:hAnsi="Arial"/>
-          <w:b/>
-          <w:sz w:val="18"/>
-        </w:rPr>
+        <w:rPr/>
         <w:t>2] CPF: [CPF]</w:t>
       </w:r>
     </w:p>

</xml_diff>

<commit_message>
fix(contrato): assinaturas com nome numa linha e CPF/CNPJ embaixo (padrao uniforme Heading 2)
Separa nome+CPF que estavam na mesma linha (empresa, cliente, testemunha 2); cliente nao mistura mais nome e CPF. Script idempotente organizar_assinaturas.py.

Co-Authored-By: Claude Opus 4.8 (1M context) <noreply@anthropic.com>
</commit_message>
<xml_diff>
--- a/modelo_contrato_mapeado.docx
+++ b/modelo_contrato_mapeado.docx
@@ -9540,52 +9540,15 @@
         <w:ind w:left="1593" w:right="38" w:hanging="1345"/>
       </w:pPr>
       <w:r>
-        <w:t>INSPIRIUM</w:t>
-      </w:r>
-      <w:r>
-        <w:rPr>
-          <w:spacing w:val="-8"/>
-        </w:rPr>
-        <w:t xml:space="preserve"> </w:t>
-      </w:r>
-      <w:r>
-        <w:t>MOVEIS</w:t>
-      </w:r>
-      <w:r>
-        <w:rPr>
-          <w:spacing w:val="-8"/>
-        </w:rPr>
-        <w:t xml:space="preserve"> </w:t>
-      </w:r>
-      <w:r>
-        <w:t>PLANEJADOS</w:t>
-      </w:r>
-      <w:r>
-        <w:rPr>
-          <w:spacing w:val="-8"/>
-        </w:rPr>
-        <w:t xml:space="preserve"> </w:t>
-      </w:r>
-      <w:r>
-        <w:t>E</w:t>
-      </w:r>
-      <w:r>
-        <w:rPr>
-          <w:spacing w:val="-8"/>
-        </w:rPr>
-        <w:t xml:space="preserve"> </w:t>
-      </w:r>
-      <w:r>
-        <w:t>DECORACAO</w:t>
-      </w:r>
-      <w:r>
-        <w:rPr>
-          <w:spacing w:val="-8"/>
-        </w:rPr>
-        <w:t xml:space="preserve"> </w:t>
-      </w:r>
-      <w:r>
-        <w:t>LTDA CNPJ: 19.152.134/0001-56</w:t>
+        <w:t>INSPIRIUM MOVEIS PLANEJADOS E DECORACAO LTDA</w:t>
+      </w:r>
+    </w:p>
+    <w:p>
+      <w:pPr>
+        <w:pStyle w:val="Heading2"/>
+      </w:pPr>
+      <w:r>
+        <w:t>CNPJ: 19.152.134/0001-56</w:t>
       </w:r>
     </w:p>
     <w:p>
@@ -9600,8 +9563,15 @@
         </w:rPr>
       </w:pPr>
       <w:r>
-        <w:rPr/>
-        <w:t>[NOME_CLIENTE] CPF/CNPJ: [CPF]</w:t>
+        <w:t>[NOME_CLIENTE]</w:t>
+      </w:r>
+    </w:p>
+    <w:p>
+      <w:pPr>
+        <w:pStyle w:val="Heading2"/>
+      </w:pPr>
+      <w:r>
+        <w:t>CPF/CNPJ: [CPF]</w:t>
       </w:r>
     </w:p>
     <w:p>
@@ -9897,16 +9867,15 @@
         </w:rPr>
       </w:pPr>
       <w:r>
-        <w:rPr/>
-        <w:t>[NOME_TESTEMUNHA</w:t>
-      </w:r>
-      <w:r>
-        <w:rPr/>
-        <w:t>_</w:t>
-      </w:r>
-      <w:r>
-        <w:rPr/>
-        <w:t>2] CPF: [CPF]</w:t>
+        <w:t>[NOME_TESTEMUNHA_2]</w:t>
+      </w:r>
+    </w:p>
+    <w:p>
+      <w:pPr>
+        <w:pStyle w:val="Heading2"/>
+      </w:pPr>
+      <w:r>
+        <w:t>CPF: [CPF]</w:t>
       </w:r>
     </w:p>
     <w:p>

</xml_diff>